<commit_message>
Documentacion: Creacion y Estructura para el manual de usuario
</commit_message>
<xml_diff>
--- a/TI.1.3. PAO202651_RESTFUL_JAVA_SINBDD_NRC36884_GR03/01. UML/01 ERS/ERS_RESTFUL_JAVA_SINBDD_GR03.docx
+++ b/TI.1.3. PAO202651_RESTFUL_JAVA_SINBDD_NRC36884_GR03/01. UML/01 ERS/ERS_RESTFUL_JAVA_SINBDD_GR03.docx
@@ -352,7 +352,7 @@
                                 <w:szCs w:val="28"/>
                                 <w:lang w:eastAsia="es-EC"/>
                               </w:rPr>
-                              <w:t>07/10/2026</w:t>
+                              <w:t>24/10/2026</w:t>
                             </w:r>
                             <w:r>
                               <w:rPr>
@@ -674,7 +674,7 @@
                           <w:szCs w:val="28"/>
                           <w:lang w:eastAsia="es-EC"/>
                         </w:rPr>
-                        <w:t>07/10/2026</w:t>
+                        <w:t>24/10/2026</w:t>
                       </w:r>
                       <w:r>
                         <w:rPr>
@@ -9972,8 +9972,21 @@
           <w:numId w:val="34"/>
         </w:numPr>
       </w:pPr>
-      <w:r>
-        <w:t>Multi-canal: La aplicación se despliega como cliente de consola, cliente de escritorio (Java Swing), aplicación Web (navegador) y Aplicación Móvil (Android), todas consumiendo el mismo servicio backend para garantizar consistencia en los resultados independientemente del canal.</w:t>
+      <w:proofErr w:type="spellStart"/>
+      <w:r>
+        <w:t>Multi-canal</w:t>
+      </w:r>
+      <w:proofErr w:type="spellEnd"/>
+      <w:r>
+        <w:t xml:space="preserve">: La aplicación se despliega como cliente de consola, cliente de escritorio (Java Swing), aplicación Web (navegador) y Aplicación Móvil (Android), todas consumiendo el mismo servicio </w:t>
+      </w:r>
+      <w:proofErr w:type="spellStart"/>
+      <w:r>
+        <w:t>backend</w:t>
+      </w:r>
+      <w:proofErr w:type="spellEnd"/>
+      <w:r>
+        <w:t xml:space="preserve"> para garantizar consistencia en los resultados independientemente del canal.</w:t>
       </w:r>
     </w:p>
     <w:p>
@@ -10090,8 +10103,16 @@
         <w:t xml:space="preserve"> con Java (</w:t>
       </w:r>
       <w:bookmarkEnd w:id="2"/>
-      <w:r>
-        <w:t>Spring-Boot)</w:t>
+      <w:proofErr w:type="spellStart"/>
+      <w:r>
+        <w:t>Jakarta</w:t>
+      </w:r>
+      <w:proofErr w:type="spellEnd"/>
+      <w:r>
+        <w:t xml:space="preserve"> REST (JAX-RS), </w:t>
+      </w:r>
+      <w:r>
+        <w:t>)</w:t>
       </w:r>
     </w:p>
     <w:p/>
@@ -10285,7 +10306,15 @@
         <w:jc w:val="left"/>
       </w:pPr>
       <w:r>
-        <w:t>1. Login y autenticación del usuario único (credenciales creadas previamente y mantenidas en memoria o configuración).</w:t>
+        <w:t xml:space="preserve">1. </w:t>
+      </w:r>
+      <w:proofErr w:type="spellStart"/>
+      <w:r>
+        <w:t>Login</w:t>
+      </w:r>
+      <w:proofErr w:type="spellEnd"/>
+      <w:r>
+        <w:t xml:space="preserve"> y autenticación del usuario único (credenciales creadas previamente y mantenidas en memoria o configuración).</w:t>
       </w:r>
     </w:p>
     <w:p>
@@ -10845,12 +10874,14 @@
                 <w:rFonts w:cs="Calibri"/>
               </w:rPr>
             </w:pPr>
+            <w:proofErr w:type="spellStart"/>
             <w:r>
               <w:rPr>
                 <w:rFonts w:cs="Calibri"/>
               </w:rPr>
               <w:t>Endpoint</w:t>
             </w:r>
+            <w:proofErr w:type="spellEnd"/>
           </w:p>
         </w:tc>
         <w:tc>
@@ -11105,6 +11136,7 @@
               </w:rPr>
             </w:pPr>
             <w:bookmarkStart w:id="18" w:name="_Toc61544620"/>
+            <w:proofErr w:type="spellStart"/>
             <w:r>
               <w:rPr>
                 <w:rFonts w:cs="Calibri"/>
@@ -11112,6 +11144,7 @@
               <w:t>Netbeans</w:t>
             </w:r>
             <w:bookmarkEnd w:id="18"/>
+            <w:proofErr w:type="spellEnd"/>
           </w:p>
         </w:tc>
         <w:tc>
@@ -11412,8 +11445,21 @@
                 <w:rFonts w:cs="Calibri"/>
               </w:rPr>
             </w:pPr>
-            <w:r>
-              <w:t>Application Programming Interface</w:t>
+            <w:proofErr w:type="spellStart"/>
+            <w:r>
+              <w:t>Application</w:t>
+            </w:r>
+            <w:proofErr w:type="spellEnd"/>
+            <w:r>
+              <w:t xml:space="preserve"> </w:t>
+            </w:r>
+            <w:proofErr w:type="spellStart"/>
+            <w:r>
+              <w:t>Programming</w:t>
+            </w:r>
+            <w:proofErr w:type="spellEnd"/>
+            <w:r>
+              <w:t xml:space="preserve"> Interface</w:t>
             </w:r>
           </w:p>
         </w:tc>
@@ -11446,8 +11492,21 @@
                 <w:rFonts w:cs="Calibri"/>
               </w:rPr>
             </w:pPr>
-            <w:r>
-              <w:t>Representational State Transfer</w:t>
+            <w:proofErr w:type="spellStart"/>
+            <w:r>
+              <w:t>Representational</w:t>
+            </w:r>
+            <w:proofErr w:type="spellEnd"/>
+            <w:r>
+              <w:t xml:space="preserve"> </w:t>
+            </w:r>
+            <w:proofErr w:type="spellStart"/>
+            <w:r>
+              <w:t>State</w:t>
+            </w:r>
+            <w:proofErr w:type="spellEnd"/>
+            <w:r>
+              <w:t xml:space="preserve"> Transfer</w:t>
             </w:r>
           </w:p>
         </w:tc>
@@ -11484,9 +11543,19 @@
                 <w:lang w:val="en-US"/>
               </w:rPr>
             </w:pPr>
-            <w:r>
-              <w:t>Hypertext Transfer Protocol</w:t>
-            </w:r>
+            <w:proofErr w:type="spellStart"/>
+            <w:r>
+              <w:t>Hypertext</w:t>
+            </w:r>
+            <w:proofErr w:type="spellEnd"/>
+            <w:r>
+              <w:t xml:space="preserve"> Transfer </w:t>
+            </w:r>
+            <w:proofErr w:type="spellStart"/>
+            <w:r>
+              <w:t>Protocol</w:t>
+            </w:r>
+            <w:proofErr w:type="spellEnd"/>
           </w:p>
         </w:tc>
       </w:tr>
@@ -11519,9 +11588,27 @@
                 <w:lang w:val="es-EC"/>
               </w:rPr>
             </w:pPr>
-            <w:r>
-              <w:t>Hypertext Transfer Protocol Secure</w:t>
-            </w:r>
+            <w:proofErr w:type="spellStart"/>
+            <w:r>
+              <w:t>Hypertext</w:t>
+            </w:r>
+            <w:proofErr w:type="spellEnd"/>
+            <w:r>
+              <w:t xml:space="preserve"> Transfer </w:t>
+            </w:r>
+            <w:proofErr w:type="spellStart"/>
+            <w:r>
+              <w:t>Protocol</w:t>
+            </w:r>
+            <w:proofErr w:type="spellEnd"/>
+            <w:r>
+              <w:t xml:space="preserve"> </w:t>
+            </w:r>
+            <w:proofErr w:type="spellStart"/>
+            <w:r>
+              <w:t>Secure</w:t>
+            </w:r>
+            <w:proofErr w:type="spellEnd"/>
           </w:p>
         </w:tc>
       </w:tr>
@@ -11563,7 +11650,35 @@
               <w:rPr>
                 <w:rFonts w:cs="Calibri"/>
               </w:rPr>
-              <w:t xml:space="preserve">Transferencia de Estado Representacional (Represantational State Transfer). </w:t>
+              <w:t>Transferencia de Estado Representacional (</w:t>
+            </w:r>
+            <w:proofErr w:type="spellStart"/>
+            <w:r>
+              <w:rPr>
+                <w:rFonts w:cs="Calibri"/>
+              </w:rPr>
+              <w:t>Represantational</w:t>
+            </w:r>
+            <w:proofErr w:type="spellEnd"/>
+            <w:r>
+              <w:rPr>
+                <w:rFonts w:cs="Calibri"/>
+              </w:rPr>
+              <w:t xml:space="preserve"> </w:t>
+            </w:r>
+            <w:proofErr w:type="spellStart"/>
+            <w:r>
+              <w:rPr>
+                <w:rFonts w:cs="Calibri"/>
+              </w:rPr>
+              <w:t>State</w:t>
+            </w:r>
+            <w:proofErr w:type="spellEnd"/>
+            <w:r>
+              <w:rPr>
+                <w:rFonts w:cs="Calibri"/>
+              </w:rPr>
+              <w:t xml:space="preserve"> Transfer). </w:t>
             </w:r>
           </w:p>
         </w:tc>
@@ -11603,7 +11718,49 @@
               <w:rPr>
                 <w:rFonts w:cs="Calibri"/>
               </w:rPr>
-              <w:t>Lenguaje de Marcado Extensible (eXtensible Markup Language).</w:t>
+              <w:t>Lenguaje de Marcado Extensible (</w:t>
+            </w:r>
+            <w:proofErr w:type="spellStart"/>
+            <w:r>
+              <w:rPr>
+                <w:rFonts w:cs="Calibri"/>
+              </w:rPr>
+              <w:t>eXtensible</w:t>
+            </w:r>
+            <w:proofErr w:type="spellEnd"/>
+            <w:r>
+              <w:rPr>
+                <w:rFonts w:cs="Calibri"/>
+              </w:rPr>
+              <w:t xml:space="preserve"> </w:t>
+            </w:r>
+            <w:proofErr w:type="spellStart"/>
+            <w:r>
+              <w:rPr>
+                <w:rFonts w:cs="Calibri"/>
+              </w:rPr>
+              <w:t>Markup</w:t>
+            </w:r>
+            <w:proofErr w:type="spellEnd"/>
+            <w:r>
+              <w:rPr>
+                <w:rFonts w:cs="Calibri"/>
+              </w:rPr>
+              <w:t xml:space="preserve"> </w:t>
+            </w:r>
+            <w:proofErr w:type="spellStart"/>
+            <w:r>
+              <w:rPr>
+                <w:rFonts w:cs="Calibri"/>
+              </w:rPr>
+              <w:t>Language</w:t>
+            </w:r>
+            <w:proofErr w:type="spellEnd"/>
+            <w:r>
+              <w:rPr>
+                <w:rFonts w:cs="Calibri"/>
+              </w:rPr>
+              <w:t>).</w:t>
             </w:r>
           </w:p>
         </w:tc>
@@ -11646,7 +11803,35 @@
               <w:rPr>
                 <w:rFonts w:cs="Calibri"/>
               </w:rPr>
-              <w:t xml:space="preserve">Protocolo de Transferencia de Hipertexto (Hypertext Transfer Protocol). </w:t>
+              <w:t>Protocolo de Transferencia de Hipertexto (</w:t>
+            </w:r>
+            <w:proofErr w:type="spellStart"/>
+            <w:r>
+              <w:rPr>
+                <w:rFonts w:cs="Calibri"/>
+              </w:rPr>
+              <w:t>Hypertext</w:t>
+            </w:r>
+            <w:proofErr w:type="spellEnd"/>
+            <w:r>
+              <w:rPr>
+                <w:rFonts w:cs="Calibri"/>
+              </w:rPr>
+              <w:t xml:space="preserve"> Transfer </w:t>
+            </w:r>
+            <w:proofErr w:type="spellStart"/>
+            <w:r>
+              <w:rPr>
+                <w:rFonts w:cs="Calibri"/>
+              </w:rPr>
+              <w:t>Protocol</w:t>
+            </w:r>
+            <w:proofErr w:type="spellEnd"/>
+            <w:r>
+              <w:rPr>
+                <w:rFonts w:cs="Calibri"/>
+              </w:rPr>
+              <w:t xml:space="preserve">). </w:t>
             </w:r>
           </w:p>
         </w:tc>
@@ -11686,7 +11871,21 @@
               <w:rPr>
                 <w:rFonts w:cs="Calibri"/>
               </w:rPr>
-              <w:t>Interfaz de línea de comandos (Command Line Interface)</w:t>
+              <w:t>Interfaz de línea de comandos (</w:t>
+            </w:r>
+            <w:proofErr w:type="spellStart"/>
+            <w:r>
+              <w:rPr>
+                <w:rFonts w:cs="Calibri"/>
+              </w:rPr>
+              <w:t>Command</w:t>
+            </w:r>
+            <w:proofErr w:type="spellEnd"/>
+            <w:r>
+              <w:rPr>
+                <w:rFonts w:cs="Calibri"/>
+              </w:rPr>
+              <w:t xml:space="preserve"> Line Interface)</w:t>
             </w:r>
           </w:p>
         </w:tc>
@@ -12132,7 +12331,21 @@
               <w:rPr>
                 <w:rFonts w:asciiTheme="minorHAnsi" w:hAnsiTheme="minorHAnsi" w:cstheme="minorHAnsi"/>
               </w:rPr>
-              <w:t xml:space="preserve">De la plantilla de formato del documento © &amp; Coloriuris </w:t>
+              <w:t xml:space="preserve">De la plantilla de formato del documento © &amp; </w:t>
+            </w:r>
+            <w:proofErr w:type="spellStart"/>
+            <w:r>
+              <w:rPr>
+                <w:rFonts w:asciiTheme="minorHAnsi" w:hAnsiTheme="minorHAnsi" w:cstheme="minorHAnsi"/>
+              </w:rPr>
+              <w:t>Coloriuris</w:t>
+            </w:r>
+            <w:proofErr w:type="spellEnd"/>
+            <w:r>
+              <w:rPr>
+                <w:rFonts w:asciiTheme="minorHAnsi" w:hAnsiTheme="minorHAnsi" w:cstheme="minorHAnsi"/>
+              </w:rPr>
+              <w:t xml:space="preserve"> </w:t>
             </w:r>
             <w:hyperlink r:id="rId12">
               <w:r>
@@ -12745,7 +12958,7 @@
               </wp:anchor>
             </w:drawing>
           </mc:Choice>
-          <mc:Fallback xmlns:w16du="http://schemas.microsoft.com/office/word/2023/wordml/word16du" xmlns:w16sdtfl="http://schemas.microsoft.com/office/word/2024/wordml/sdtformatlock" xmlns:oel="http://schemas.microsoft.com/office/2019/extlst">
+          <mc:Fallback xmlns:oel="http://schemas.microsoft.com/office/2019/extlst" xmlns:w16sdtfl="http://schemas.microsoft.com/office/word/2024/wordml/sdtformatlock" xmlns:w16du="http://schemas.microsoft.com/office/word/2023/wordml/word16du">
             <w:pict>
               <v:rect w14:anchorId="6C311DD8" id="Rectangle 1979" o:spid="_x0000_s1026" style="position:absolute;margin-left:113.45pt;margin-top:12.85pt;width:3.85pt;height:1.4pt;z-index:-251658240;visibility:visible;mso-wrap-style:square;mso-width-percent:0;mso-height-percent:0;mso-wrap-distance-left:9pt;mso-wrap-distance-top:0;mso-wrap-distance-right:9pt;mso-wrap-distance-bottom:0;mso-position-horizontal:absolute;mso-position-horizontal-relative:page;mso-position-vertical:absolute;mso-position-vertical-relative:text;mso-width-percent:0;mso-height-percent:0;mso-width-relative:page;mso-height-relative:page;v-text-anchor:top" o:gfxdata="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" fillcolor="black" stroked="f">
                 <w10:wrap anchorx="page"/>
@@ -13084,7 +13297,15 @@
         <w:spacing w:before="0" w:after="0"/>
       </w:pPr>
       <w:r>
-        <w:t>Los diagramas del sistema se elaboran con la herramienta PowerDesigner.</w:t>
+        <w:t xml:space="preserve">Los diagramas del sistema se elaboran con la herramienta </w:t>
+      </w:r>
+      <w:proofErr w:type="spellStart"/>
+      <w:r>
+        <w:t>PowerDesigner</w:t>
+      </w:r>
+      <w:proofErr w:type="spellEnd"/>
+      <w:r>
+        <w:t>.</w:t>
       </w:r>
     </w:p>
     <w:p>
@@ -13110,7 +13331,15 @@
         <w:spacing w:before="0" w:after="0"/>
       </w:pPr>
       <w:r>
-        <w:t>Se requiere una conexión a internet con buen ancho de banda para las transacciones con el backend.</w:t>
+        <w:t xml:space="preserve">Se requiere una conexión a internet con buen ancho de banda para las transacciones con el </w:t>
+      </w:r>
+      <w:proofErr w:type="spellStart"/>
+      <w:r>
+        <w:t>backend</w:t>
+      </w:r>
+      <w:proofErr w:type="spellEnd"/>
+      <w:r>
+        <w:t>.</w:t>
       </w:r>
     </w:p>
     <w:p>
@@ -13123,7 +13352,15 @@
         <w:spacing w:before="0" w:after="0"/>
       </w:pPr>
       <w:r>
-        <w:t xml:space="preserve">Exigido por el enunciado: el backend se programa en Java, con servicios web </w:t>
+        <w:t xml:space="preserve">Exigido por el enunciado: el </w:t>
+      </w:r>
+      <w:proofErr w:type="spellStart"/>
+      <w:r>
+        <w:t>backend</w:t>
+      </w:r>
+      <w:proofErr w:type="spellEnd"/>
+      <w:r>
+        <w:t xml:space="preserve"> se programa en Java, con servicios web </w:t>
       </w:r>
       <w:r>
         <w:t>RESTFUL</w:t>
@@ -13150,8 +13387,43 @@
       <w:r>
         <w:t xml:space="preserve">Decisión de diseño del grupo (no exigida por el enunciado): </w:t>
       </w:r>
-      <w:r>
-        <w:t>Spring Boot como framework para desarrollar la API REST en Java. El backend se ejecutará con el servidor web integrado que proporciona Spring Boot; por tanto, no requiere Payara Server.</w:t>
+      <w:proofErr w:type="spellStart"/>
+      <w:r>
+        <w:t>Jakarta</w:t>
+      </w:r>
+      <w:proofErr w:type="spellEnd"/>
+      <w:r>
+        <w:t xml:space="preserve"> REST (JAX-RS), </w:t>
+      </w:r>
+      <w:r>
+        <w:t xml:space="preserve"> como </w:t>
+      </w:r>
+      <w:proofErr w:type="spellStart"/>
+      <w:r>
+        <w:t>framework</w:t>
+      </w:r>
+      <w:proofErr w:type="spellEnd"/>
+      <w:r>
+        <w:t xml:space="preserve"> para desarrollar la API REST en Java. El </w:t>
+      </w:r>
+      <w:proofErr w:type="spellStart"/>
+      <w:r>
+        <w:t>backend</w:t>
+      </w:r>
+      <w:proofErr w:type="spellEnd"/>
+      <w:r>
+        <w:t xml:space="preserve"> se ejecutará con el servidor web integrado que proporciona </w:t>
+      </w:r>
+      <w:proofErr w:type="spellStart"/>
+      <w:r>
+        <w:t>Jakarta</w:t>
+      </w:r>
+      <w:proofErr w:type="spellEnd"/>
+      <w:r>
+        <w:t xml:space="preserve"> REST (JAX-RS), </w:t>
+      </w:r>
+      <w:r>
+        <w:t>; por tanto, no requiere Payara Server.</w:t>
       </w:r>
     </w:p>
     <w:p>
@@ -13827,6 +14099,7 @@
                 <w:szCs w:val="20"/>
               </w:rPr>
             </w:pPr>
+            <w:proofErr w:type="spellStart"/>
             <w:r>
               <w:rPr>
                 <w:sz w:val="20"/>
@@ -13834,6 +14107,7 @@
               </w:rPr>
               <w:t>Genius</w:t>
             </w:r>
+            <w:proofErr w:type="spellEnd"/>
           </w:p>
         </w:tc>
         <w:tc>
@@ -13958,6 +14232,7 @@
                 <w:szCs w:val="20"/>
               </w:rPr>
             </w:pPr>
+            <w:proofErr w:type="spellStart"/>
             <w:r>
               <w:rPr>
                 <w:sz w:val="20"/>
@@ -13965,6 +14240,7 @@
               </w:rPr>
               <w:t>Genius</w:t>
             </w:r>
+            <w:proofErr w:type="spellEnd"/>
           </w:p>
         </w:tc>
         <w:tc>
@@ -14175,28 +14451,60 @@
                 <w:sz w:val="20"/>
                 <w:szCs w:val="20"/>
               </w:rPr>
-              <w:t xml:space="preserve">, Memoria Ram: </w:t>
-            </w:r>
+              <w:t xml:space="preserve">, Memoria </w:t>
+            </w:r>
+            <w:proofErr w:type="spellStart"/>
             <w:r>
               <w:rPr>
                 <w:sz w:val="20"/>
                 <w:szCs w:val="20"/>
               </w:rPr>
-              <w:t>4</w:t>
-            </w:r>
+              <w:t>Ram</w:t>
+            </w:r>
+            <w:proofErr w:type="spellEnd"/>
             <w:r>
               <w:rPr>
                 <w:sz w:val="20"/>
                 <w:szCs w:val="20"/>
               </w:rPr>
-              <w:t>GB</w:t>
+              <w:t xml:space="preserve">: </w:t>
             </w:r>
             <w:r>
               <w:rPr>
                 <w:sz w:val="20"/>
                 <w:szCs w:val="20"/>
               </w:rPr>
-              <w:t xml:space="preserve">. 256gb ssd. </w:t>
+              <w:t>4</w:t>
+            </w:r>
+            <w:r>
+              <w:rPr>
+                <w:sz w:val="20"/>
+                <w:szCs w:val="20"/>
+              </w:rPr>
+              <w:t>GB</w:t>
+            </w:r>
+            <w:r>
+              <w:rPr>
+                <w:sz w:val="20"/>
+                <w:szCs w:val="20"/>
+              </w:rPr>
+              <w:t xml:space="preserve">. 256gb </w:t>
+            </w:r>
+            <w:proofErr w:type="spellStart"/>
+            <w:r>
+              <w:rPr>
+                <w:sz w:val="20"/>
+                <w:szCs w:val="20"/>
+              </w:rPr>
+              <w:t>ssd</w:t>
+            </w:r>
+            <w:proofErr w:type="spellEnd"/>
+            <w:r>
+              <w:rPr>
+                <w:sz w:val="20"/>
+                <w:szCs w:val="20"/>
+              </w:rPr>
+              <w:t xml:space="preserve">. </w:t>
             </w:r>
           </w:p>
         </w:tc>
@@ -14614,8 +14922,21 @@
               <w:cnfStyle w:val="000000100000" w:firstRow="0" w:lastRow="0" w:firstColumn="0" w:lastColumn="0" w:oddVBand="0" w:evenVBand="0" w:oddHBand="1" w:evenHBand="0" w:firstRowFirstColumn="0" w:firstRowLastColumn="0" w:lastRowFirstColumn="0" w:lastRowLastColumn="0"/>
             </w:pPr>
             <w:r>
-              <w:t>Nombre: Power Designer</w:t>
-            </w:r>
+              <w:t xml:space="preserve">Nombre: </w:t>
+            </w:r>
+            <w:proofErr w:type="spellStart"/>
+            <w:r>
+              <w:t>Power</w:t>
+            </w:r>
+            <w:proofErr w:type="spellEnd"/>
+            <w:r>
+              <w:t xml:space="preserve"> </w:t>
+            </w:r>
+            <w:proofErr w:type="spellStart"/>
+            <w:r>
+              <w:t>Designer</w:t>
+            </w:r>
+            <w:proofErr w:type="spellEnd"/>
           </w:p>
           <w:p>
             <w:pPr>
@@ -14716,49 +15037,95 @@
           <w:p>
             <w:pPr>
               <w:cnfStyle w:val="000000000000" w:firstRow="0" w:lastRow="0" w:firstColumn="0" w:lastColumn="0" w:oddVBand="0" w:evenVBand="0" w:oddHBand="0" w:evenHBand="0" w:firstRowFirstColumn="0" w:firstRowLastColumn="0" w:lastRowFirstColumn="0" w:lastRowLastColumn="0"/>
-            </w:pPr>
-            <w:r>
-              <w:t xml:space="preserve">Nombre: </w:t>
-            </w:r>
-            <w:r>
-              <w:t>Spring Boot</w:t>
-            </w:r>
-            <w:r>
+              <w:rPr>
+                <w:lang w:val="en-US"/>
+              </w:rPr>
+            </w:pPr>
+            <w:proofErr w:type="spellStart"/>
+            <w:r>
+              <w:rPr>
+                <w:lang w:val="en-US"/>
+              </w:rPr>
+              <w:t>Nombre</w:t>
+            </w:r>
+            <w:proofErr w:type="spellEnd"/>
+            <w:r>
+              <w:rPr>
+                <w:lang w:val="en-US"/>
+              </w:rPr>
+              <w:t xml:space="preserve">: </w:t>
+            </w:r>
+            <w:r>
+              <w:rPr>
+                <w:lang w:val="en-US"/>
+              </w:rPr>
+              <w:t xml:space="preserve">Jakarta REST (JAX-RS), </w:t>
+            </w:r>
+            <w:r>
+              <w:rPr>
+                <w:lang w:val="en-US"/>
+              </w:rPr>
               <w:t xml:space="preserve"> </w:t>
             </w:r>
           </w:p>
           <w:p>
             <w:pPr>
               <w:cnfStyle w:val="000000000000" w:firstRow="0" w:lastRow="0" w:firstColumn="0" w:lastColumn="0" w:oddVBand="0" w:evenVBand="0" w:oddHBand="0" w:evenHBand="0" w:firstRowFirstColumn="0" w:firstRowLastColumn="0" w:lastRowFirstColumn="0" w:lastRowLastColumn="0"/>
-            </w:pPr>
-            <w:r>
-              <w:t xml:space="preserve">Versión: 8/10 </w:t>
+              <w:rPr>
+                <w:lang w:val="en-US"/>
+              </w:rPr>
+            </w:pPr>
+            <w:proofErr w:type="spellStart"/>
+            <w:r>
+              <w:rPr>
+                <w:lang w:val="en-US"/>
+              </w:rPr>
+              <w:t>Versión</w:t>
+            </w:r>
+            <w:proofErr w:type="spellEnd"/>
+            <w:r>
+              <w:rPr>
+                <w:lang w:val="en-US"/>
+              </w:rPr>
+              <w:t xml:space="preserve">: 8/10 </w:t>
             </w:r>
           </w:p>
           <w:p>
             <w:pPr>
               <w:cnfStyle w:val="000000000000" w:firstRow="0" w:lastRow="0" w:firstColumn="0" w:lastColumn="0" w:oddVBand="0" w:evenVBand="0" w:oddHBand="0" w:evenHBand="0" w:firstRowFirstColumn="0" w:firstRowLastColumn="0" w:lastRowFirstColumn="0" w:lastRowLastColumn="0"/>
               <w:rPr>
-                <w:lang w:val="es-EC"/>
-              </w:rPr>
-            </w:pPr>
-            <w:r>
-              <w:rPr>
-                <w:lang w:val="es-EC"/>
+                <w:lang w:val="en-US"/>
+              </w:rPr>
+            </w:pPr>
+            <w:r>
+              <w:rPr>
+                <w:lang w:val="en-US"/>
               </w:rPr>
               <w:t xml:space="preserve">Fuente: </w:t>
             </w:r>
             <w:r>
               <w:rPr>
-                <w:lang w:val="es-EC"/>
-              </w:rPr>
-              <w:t>h</w:t>
-            </w:r>
-            <w:r>
-              <w:rPr>
-                <w:lang w:val="es-EC"/>
-              </w:rPr>
-              <w:t>ttps://spring.io/projects/spring-boot</w:t>
+                <w:lang w:val="en-US"/>
+              </w:rPr>
+              <w:t>https://</w:t>
+            </w:r>
+            <w:r>
+              <w:rPr>
+                <w:lang w:val="en-US"/>
+              </w:rPr>
+              <w:t>Jakarta REST</w:t>
+            </w:r>
+            <w:r>
+              <w:rPr>
+                <w:lang w:val="en-US"/>
+              </w:rPr>
+              <w:t>.io/projects/</w:t>
+            </w:r>
+            <w:r>
+              <w:rPr>
+                <w:lang w:val="en-US"/>
+              </w:rPr>
+              <w:t xml:space="preserve">Jakarta REST (JAX-RS), </w:t>
             </w:r>
           </w:p>
           <w:p>
@@ -14787,7 +15154,26 @@
               <w:cnfStyle w:val="000000000000" w:firstRow="0" w:lastRow="0" w:firstColumn="0" w:lastColumn="0" w:oddVBand="0" w:evenVBand="0" w:oddHBand="0" w:evenHBand="0" w:firstRowFirstColumn="0" w:firstRowLastColumn="0" w:lastRowFirstColumn="0" w:lastRowLastColumn="0"/>
             </w:pPr>
             <w:r>
-              <w:t>Framework de código abierto para desarrollar aplicaciones Java. Spring Web permite crear controladores y endpoints REST que reciben solicitudes HTTP y devuelven respuestas a los clientes.</w:t>
+              <w:t xml:space="preserve">Framework de código abierto para desarrollar aplicaciones Java. </w:t>
+            </w:r>
+            <w:proofErr w:type="spellStart"/>
+            <w:r>
+              <w:t>Jakarta</w:t>
+            </w:r>
+            <w:proofErr w:type="spellEnd"/>
+            <w:r>
+              <w:t xml:space="preserve"> REST</w:t>
+            </w:r>
+            <w:r>
+              <w:t xml:space="preserve"> Web permite crear controladores y </w:t>
+            </w:r>
+            <w:proofErr w:type="spellStart"/>
+            <w:r>
+              <w:t>endpoints</w:t>
+            </w:r>
+            <w:proofErr w:type="spellEnd"/>
+            <w:r>
+              <w:t xml:space="preserve"> REST que reciben solicitudes HTTP y devuelven respuestas a los clientes.</w:t>
             </w:r>
           </w:p>
         </w:tc>
@@ -14835,81 +15221,165 @@
               <w:t xml:space="preserve">Nombre: </w:t>
             </w:r>
             <w:r>
-              <w:t>Servidor integrado de Spring Boot (Apache Tomcat, si se usa Spring Web)</w:t>
+              <w:t xml:space="preserve">Servidor integrado de </w:t>
+            </w:r>
+            <w:proofErr w:type="spellStart"/>
+            <w:r>
+              <w:t>Jakarta</w:t>
+            </w:r>
+            <w:proofErr w:type="spellEnd"/>
+            <w:r>
+              <w:t xml:space="preserve"> REST (JAX-RS), </w:t>
+            </w:r>
+            <w:r>
+              <w:t xml:space="preserve"> (Apache Tomcat, si se usa </w:t>
+            </w:r>
+            <w:proofErr w:type="spellStart"/>
+            <w:r>
+              <w:t>Jakarta</w:t>
+            </w:r>
+            <w:proofErr w:type="spellEnd"/>
+            <w:r>
+              <w:t xml:space="preserve"> REST</w:t>
+            </w:r>
+            <w:r>
+              <w:t xml:space="preserve"> Web)</w:t>
             </w:r>
           </w:p>
           <w:p>
             <w:pPr>
               <w:cnfStyle w:val="000000100000" w:firstRow="0" w:lastRow="0" w:firstColumn="0" w:lastColumn="0" w:oddVBand="0" w:evenVBand="0" w:oddHBand="1" w:evenHBand="0" w:firstRowFirstColumn="0" w:firstRowLastColumn="0" w:lastRowFirstColumn="0" w:lastRowLastColumn="0"/>
-            </w:pPr>
-            <w:r>
-              <w:t xml:space="preserve">Versión: 5/6 Community Edition </w:t>
+              <w:rPr>
+                <w:lang w:val="en-US"/>
+              </w:rPr>
+            </w:pPr>
+            <w:proofErr w:type="spellStart"/>
+            <w:r>
+              <w:rPr>
+                <w:lang w:val="en-US"/>
+              </w:rPr>
+              <w:t>Versión</w:t>
+            </w:r>
+            <w:proofErr w:type="spellEnd"/>
+            <w:r>
+              <w:rPr>
+                <w:lang w:val="en-US"/>
+              </w:rPr>
+              <w:t xml:space="preserve">: 5/6 Community Edition </w:t>
             </w:r>
           </w:p>
           <w:p>
             <w:pPr>
               <w:cnfStyle w:val="000000100000" w:firstRow="0" w:lastRow="0" w:firstColumn="0" w:lastColumn="0" w:oddVBand="0" w:evenVBand="0" w:oddHBand="1" w:evenHBand="0" w:firstRowFirstColumn="0" w:firstRowLastColumn="0" w:lastRowFirstColumn="0" w:lastRowLastColumn="0"/>
-            </w:pPr>
-            <w:r>
+              <w:rPr>
+                <w:lang w:val="en-US"/>
+              </w:rPr>
+            </w:pPr>
+            <w:r>
+              <w:rPr>
+                <w:lang w:val="en-US"/>
+              </w:rPr>
+              <w:lastRenderedPageBreak/>
               <w:t xml:space="preserve">Fuente: </w:t>
             </w:r>
             <w:r>
+              <w:rPr>
+                <w:lang w:val="en-US"/>
+              </w:rPr>
+              <w:t>https://</w:t>
+            </w:r>
+            <w:r>
+              <w:rPr>
+                <w:lang w:val="en-US"/>
+              </w:rPr>
+              <w:t>Jakarta REST</w:t>
+            </w:r>
+            <w:r>
+              <w:rPr>
+                <w:lang w:val="en-US"/>
+              </w:rPr>
+              <w:t>.io/projects/</w:t>
+            </w:r>
+            <w:r>
+              <w:rPr>
+                <w:lang w:val="en-US"/>
+              </w:rPr>
+              <w:t xml:space="preserve">Jakarta REST (JAX-RS), </w:t>
+            </w:r>
+          </w:p>
+          <w:p>
+            <w:pPr>
+              <w:cnfStyle w:val="000000100000" w:firstRow="0" w:lastRow="0" w:firstColumn="0" w:lastColumn="0" w:oddVBand="0" w:evenVBand="0" w:oddHBand="1" w:evenHBand="0" w:firstRowFirstColumn="0" w:firstRowLastColumn="0" w:lastRowFirstColumn="0" w:lastRowLastColumn="0"/>
+            </w:pPr>
+            <w:r>
+              <w:t xml:space="preserve">Distribución: Código abierto </w:t>
+            </w:r>
+          </w:p>
+          <w:p>
+            <w:pPr>
+              <w:cnfStyle w:val="000000100000" w:firstRow="0" w:lastRow="0" w:firstColumn="0" w:lastColumn="0" w:oddVBand="0" w:evenVBand="0" w:oddHBand="1" w:evenHBand="0" w:firstRowFirstColumn="0" w:firstRowLastColumn="0" w:lastRowFirstColumn="0" w:lastRowLastColumn="0"/>
+            </w:pPr>
+            <w:r>
+              <w:t xml:space="preserve">Precio: Gratuito </w:t>
+            </w:r>
+          </w:p>
+        </w:tc>
+        <w:tc>
+          <w:tcPr>
+            <w:tcW w:w="1413" w:type="pct"/>
+          </w:tcPr>
+          <w:p>
+            <w:pPr>
+              <w:cnfStyle w:val="000000100000" w:firstRow="0" w:lastRow="0" w:firstColumn="0" w:lastColumn="0" w:oddVBand="0" w:evenVBand="0" w:oddHBand="1" w:evenHBand="0" w:firstRowFirstColumn="0" w:firstRowLastColumn="0" w:lastRowFirstColumn="0" w:lastRowLastColumn="0"/>
+            </w:pPr>
+            <w:proofErr w:type="spellStart"/>
+            <w:r>
               <w:lastRenderedPageBreak/>
-              <w:t>https://spring.io/projects/spring-boot</w:t>
-            </w:r>
-          </w:p>
+              <w:t>Jakarta</w:t>
+            </w:r>
+            <w:proofErr w:type="spellEnd"/>
+            <w:r>
+              <w:t xml:space="preserve"> REST (JAX-RS), </w:t>
+            </w:r>
+            <w:r>
+              <w:t xml:space="preserve"> permite ejecutar la aplicación web con un servidor integrado, sin requerir la instalación </w:t>
+            </w:r>
+            <w:r>
+              <w:lastRenderedPageBreak/>
+              <w:t xml:space="preserve">independiente de </w:t>
+            </w:r>
+            <w:proofErr w:type="spellStart"/>
+            <w:r>
+              <w:t>Jakarta</w:t>
+            </w:r>
+            <w:proofErr w:type="spellEnd"/>
+            <w:r>
+              <w:t xml:space="preserve"> REST (JAX-RS), </w:t>
+            </w:r>
+            <w:r>
+              <w:t>.</w:t>
+            </w:r>
+          </w:p>
+        </w:tc>
+        <w:tc>
+          <w:tcPr>
+            <w:tcW w:w="1080" w:type="pct"/>
+          </w:tcPr>
           <w:p>
             <w:pPr>
               <w:cnfStyle w:val="000000100000" w:firstRow="0" w:lastRow="0" w:firstColumn="0" w:lastColumn="0" w:oddVBand="0" w:evenVBand="0" w:oddHBand="1" w:evenHBand="0" w:firstRowFirstColumn="0" w:firstRowLastColumn="0" w:lastRowFirstColumn="0" w:lastRowLastColumn="0"/>
             </w:pPr>
             <w:r>
-              <w:t xml:space="preserve">Distribución: Código abierto </w:t>
-            </w:r>
-          </w:p>
-          <w:p>
-            <w:pPr>
-              <w:cnfStyle w:val="000000100000" w:firstRow="0" w:lastRow="0" w:firstColumn="0" w:lastColumn="0" w:oddVBand="0" w:evenVBand="0" w:oddHBand="1" w:evenHBand="0" w:firstRowFirstColumn="0" w:firstRowLastColumn="0" w:lastRowFirstColumn="0" w:lastRowLastColumn="0"/>
-            </w:pPr>
-            <w:r>
-              <w:t xml:space="preserve">Precio: Gratuito </w:t>
-            </w:r>
-          </w:p>
-        </w:tc>
-        <w:tc>
-          <w:tcPr>
-            <w:tcW w:w="1413" w:type="pct"/>
-          </w:tcPr>
-          <w:p>
-            <w:pPr>
-              <w:cnfStyle w:val="000000100000" w:firstRow="0" w:lastRow="0" w:firstColumn="0" w:lastColumn="0" w:oddVBand="0" w:evenVBand="0" w:oddHBand="1" w:evenHBand="0" w:firstRowFirstColumn="0" w:firstRowLastColumn="0" w:lastRowFirstColumn="0" w:lastRowLastColumn="0"/>
-            </w:pPr>
-            <w:r>
               <w:lastRenderedPageBreak/>
-              <w:t xml:space="preserve">Spring Boot permite ejecutar la aplicación web con un servidor integrado, sin requerir la instalación independiente de </w:t>
-            </w:r>
-            <w:r>
-              <w:t>Spring-</w:t>
-            </w:r>
-            <w:r>
-              <w:lastRenderedPageBreak/>
-              <w:t>Boot</w:t>
-            </w:r>
-            <w:r>
-              <w:t>.</w:t>
-            </w:r>
-          </w:p>
-        </w:tc>
-        <w:tc>
-          <w:tcPr>
-            <w:tcW w:w="1080" w:type="pct"/>
-          </w:tcPr>
-          <w:p>
-            <w:pPr>
-              <w:cnfStyle w:val="000000100000" w:firstRow="0" w:lastRow="0" w:firstColumn="0" w:lastColumn="0" w:oddVBand="0" w:evenVBand="0" w:oddHBand="1" w:evenHBand="0" w:firstRowFirstColumn="0" w:firstRowLastColumn="0" w:lastRowFirstColumn="0" w:lastRowLastColumn="0"/>
-            </w:pPr>
-            <w:r>
-              <w:lastRenderedPageBreak/>
-              <w:t>Ejecutar el backend y atender las solicitudes HTTP de los clientes para la API REST.</w:t>
+              <w:t xml:space="preserve">Ejecutar el </w:t>
+            </w:r>
+            <w:proofErr w:type="spellStart"/>
+            <w:r>
+              <w:t>backend</w:t>
+            </w:r>
+            <w:proofErr w:type="spellEnd"/>
+            <w:r>
+              <w:t xml:space="preserve"> y atender las solicitudes HTTP de los clientes para la API REST.</w:t>
             </w:r>
           </w:p>
         </w:tc>
@@ -15022,7 +15492,23 @@
         <w:t xml:space="preserve"> </w:t>
       </w:r>
       <w:r>
-        <w:t>Si se elige JSON como formato, las solicitudes y respuestas que contengan datos deberán usar application/json. Las respuestas deberán incluir el código HTTP correspondiente y un cuerpo que describa el resultado o el error.</w:t>
+        <w:t xml:space="preserve">Si se elige JSON como formato, las solicitudes y respuestas que contengan datos deberán usar </w:t>
+      </w:r>
+      <w:proofErr w:type="spellStart"/>
+      <w:r>
+        <w:t>application</w:t>
+      </w:r>
+      <w:proofErr w:type="spellEnd"/>
+      <w:r>
+        <w:t>/</w:t>
+      </w:r>
+      <w:proofErr w:type="spellStart"/>
+      <w:r>
+        <w:t>json</w:t>
+      </w:r>
+      <w:proofErr w:type="spellEnd"/>
+      <w:r>
+        <w:t>. Las respuestas deberán incluir el código HTTP correspondiente y un cuerpo que describa el resultado o el error.</w:t>
       </w:r>
     </w:p>
     <w:p>
@@ -15081,7 +15567,15 @@
         <w:t>RESTFUL</w:t>
       </w:r>
       <w:r>
-        <w:t xml:space="preserve"> expuestos por los módulos del servidor backend y consumidos de la misma forma por los cuatro clientes.</w:t>
+        <w:t xml:space="preserve"> expuestos por los módulos del servidor </w:t>
+      </w:r>
+      <w:proofErr w:type="spellStart"/>
+      <w:r>
+        <w:t>backend</w:t>
+      </w:r>
+      <w:proofErr w:type="spellEnd"/>
+      <w:r>
+        <w:t xml:space="preserve"> y consumidos de la misma forma por los cuatro clientes.</w:t>
       </w:r>
       <w:r>
         <w:t xml:space="preserve"> </w:t>
@@ -15529,6 +16023,7 @@
           </w:tcPr>
           <w:p>
             <w:r>
+              <w:lastRenderedPageBreak/>
               <w:t>Descripción</w:t>
             </w:r>
           </w:p>
@@ -15557,7 +16052,6 @@
           </w:tcPr>
           <w:p>
             <w:r>
-              <w:lastRenderedPageBreak/>
               <w:t xml:space="preserve">Importancia </w:t>
             </w:r>
           </w:p>
@@ -16991,6 +17485,7 @@
     </w:p>
     <w:p>
       <w:r>
+        <w:lastRenderedPageBreak/>
         <w:t>A continuación, se presenta una lista con los requisitos funcionales</w:t>
       </w:r>
       <w:r>
@@ -17012,7 +17507,6 @@
       </w:pPr>
       <w:bookmarkStart w:id="63" w:name="_Toc83812961"/>
       <w:r>
-        <w:lastRenderedPageBreak/>
         <w:t xml:space="preserve">Tabla </w:t>
       </w:r>
       <w:r>
@@ -17660,7 +18154,14 @@
               <w:rPr>
                 <w:lang w:val="es-EC"/>
               </w:rPr>
-              <w:t>El sistema debe gestionar los errores de forma que el cliente siempre reciba una respuesta.</w:t>
+              <w:t xml:space="preserve">El sistema debe gestionar los </w:t>
+            </w:r>
+            <w:r>
+              <w:rPr>
+                <w:lang w:val="es-EC"/>
+              </w:rPr>
+              <w:lastRenderedPageBreak/>
+              <w:t>errores de forma que el cliente siempre reciba una respuesta.</w:t>
             </w:r>
           </w:p>
         </w:tc>
@@ -17673,6 +18174,7 @@
               <w:cnfStyle w:val="000000000000" w:firstRow="0" w:lastRow="0" w:firstColumn="0" w:lastColumn="0" w:oddVBand="0" w:evenVBand="0" w:oddHBand="0" w:evenHBand="0" w:firstRowFirstColumn="0" w:firstRowLastColumn="0" w:lastRowFirstColumn="0" w:lastRowLastColumn="0"/>
             </w:pPr>
             <w:r>
+              <w:lastRenderedPageBreak/>
               <w:t>Gestionar errores</w:t>
             </w:r>
           </w:p>
@@ -19693,6 +20195,7 @@
                 <w:sz w:val="22"/>
                 <w:szCs w:val="22"/>
               </w:rPr>
+              <w:lastRenderedPageBreak/>
               <w:t>Objetivo</w:t>
             </w:r>
           </w:p>
@@ -19863,7 +20366,6 @@
                 <w:sz w:val="22"/>
                 <w:szCs w:val="22"/>
               </w:rPr>
-              <w:lastRenderedPageBreak/>
               <w:t>Estabilidad</w:t>
             </w:r>
           </w:p>
@@ -21463,7 +21965,43 @@
                 <w:sz w:val="22"/>
                 <w:szCs w:val="22"/>
               </w:rPr>
-              <w:t>enerar respuesta estructurada con los campos estado, código, mensaje, resultado, unidadOrigen y unidadDestino.</w:t>
+              <w:t xml:space="preserve">enerar respuesta estructurada con los campos estado, código, mensaje, resultado, </w:t>
+            </w:r>
+            <w:proofErr w:type="spellStart"/>
+            <w:r>
+              <w:rPr>
+                <w:rFonts w:ascii="Calibri" w:hAnsi="Calibri" w:cstheme="minorHAnsi"/>
+                <w:sz w:val="22"/>
+                <w:szCs w:val="22"/>
+              </w:rPr>
+              <w:t>unidadOrigen</w:t>
+            </w:r>
+            <w:proofErr w:type="spellEnd"/>
+            <w:r>
+              <w:rPr>
+                <w:rFonts w:ascii="Calibri" w:hAnsi="Calibri" w:cstheme="minorHAnsi"/>
+                <w:sz w:val="22"/>
+                <w:szCs w:val="22"/>
+              </w:rPr>
+              <w:t xml:space="preserve"> y </w:t>
+            </w:r>
+            <w:proofErr w:type="spellStart"/>
+            <w:r>
+              <w:rPr>
+                <w:rFonts w:ascii="Calibri" w:hAnsi="Calibri" w:cstheme="minorHAnsi"/>
+                <w:sz w:val="22"/>
+                <w:szCs w:val="22"/>
+              </w:rPr>
+              <w:t>unidadDestino</w:t>
+            </w:r>
+            <w:proofErr w:type="spellEnd"/>
+            <w:r>
+              <w:rPr>
+                <w:rFonts w:ascii="Calibri" w:hAnsi="Calibri" w:cstheme="minorHAnsi"/>
+                <w:sz w:val="22"/>
+                <w:szCs w:val="22"/>
+              </w:rPr>
+              <w:t>.</w:t>
             </w:r>
           </w:p>
         </w:tc>
@@ -21914,7 +22452,16 @@
                 <w:sz w:val="22"/>
                 <w:szCs w:val="22"/>
               </w:rPr>
-              <w:t>estionar errores: ante credenciales incorrectas (AUTH-003), tokens inválidos, sesiones caducadas, unidades no soportadas o datos inconsistentes, devolver una respuesta de error estructurada.</w:t>
+              <w:t>estionar errores: ante credenciales incorrectas (AUTH-</w:t>
+            </w:r>
+            <w:r>
+              <w:rPr>
+                <w:rFonts w:ascii="Calibri" w:hAnsi="Calibri" w:cstheme="minorHAnsi"/>
+                <w:sz w:val="22"/>
+                <w:szCs w:val="22"/>
+              </w:rPr>
+              <w:lastRenderedPageBreak/>
+              <w:t>003), tokens inválidos, sesiones caducadas, unidades no soportadas o datos inconsistentes, devolver una respuesta de error estructurada.</w:t>
             </w:r>
           </w:p>
         </w:tc>
@@ -21941,6 +22488,7 @@
                 <w:sz w:val="22"/>
                 <w:szCs w:val="22"/>
               </w:rPr>
+              <w:lastRenderedPageBreak/>
               <w:t>Objetivo</w:t>
             </w:r>
           </w:p>
@@ -22004,7 +22552,6 @@
                 <w:sz w:val="22"/>
                 <w:szCs w:val="22"/>
               </w:rPr>
-              <w:lastRenderedPageBreak/>
               <w:t>Importancia</w:t>
             </w:r>
           </w:p>
@@ -22753,8 +23300,9 @@
                 <w:iCs w:val="0"/>
                 <w:color w:val="365F91" w:themeColor="accent1" w:themeShade="BF"/>
               </w:rPr>
-              <w:t xml:space="preserve">El backend del sistema debe ser desarrollado utilizando el lenguaje Java e implementando obligatoriamente la especificación </w:t>
-            </w:r>
+              <w:t xml:space="preserve">El </w:t>
+            </w:r>
+            <w:proofErr w:type="spellStart"/>
             <w:r>
               <w:rPr>
                 <w:rFonts w:ascii="Arial" w:hAnsi="Arial"/>
@@ -22762,7 +23310,37 @@
                 <w:iCs w:val="0"/>
                 <w:color w:val="365F91" w:themeColor="accent1" w:themeShade="BF"/>
               </w:rPr>
-              <w:t>Spring Boot</w:t>
+              <w:t>backend</w:t>
+            </w:r>
+            <w:proofErr w:type="spellEnd"/>
+            <w:r>
+              <w:rPr>
+                <w:rFonts w:ascii="Arial" w:hAnsi="Arial"/>
+                <w:i w:val="0"/>
+                <w:iCs w:val="0"/>
+                <w:color w:val="365F91" w:themeColor="accent1" w:themeShade="BF"/>
+              </w:rPr>
+              <w:t xml:space="preserve"> del sistema debe ser desarrollado utilizando el lenguaje Java e implementando obligatoriamente la especificación </w:t>
+            </w:r>
+            <w:proofErr w:type="spellStart"/>
+            <w:r>
+              <w:rPr>
+                <w:rFonts w:ascii="Arial" w:hAnsi="Arial"/>
+                <w:i w:val="0"/>
+                <w:iCs w:val="0"/>
+                <w:color w:val="365F91" w:themeColor="accent1" w:themeShade="BF"/>
+              </w:rPr>
+              <w:t>Jakarta</w:t>
+            </w:r>
+            <w:proofErr w:type="spellEnd"/>
+            <w:r>
+              <w:rPr>
+                <w:rFonts w:ascii="Arial" w:hAnsi="Arial"/>
+                <w:i w:val="0"/>
+                <w:iCs w:val="0"/>
+                <w:color w:val="365F91" w:themeColor="accent1" w:themeShade="BF"/>
+              </w:rPr>
+              <w:t xml:space="preserve"> REST (JAX-RS), </w:t>
             </w:r>
             <w:r>
               <w:rPr>
@@ -23361,8 +23939,9 @@
                 <w:iCs w:val="0"/>
                 <w:color w:val="365F91" w:themeColor="accent1" w:themeShade="BF"/>
               </w:rPr>
-              <w:t xml:space="preserve">El despliegue y la ejecución en red del proyecto backend debe realizarse obligatoriamente sobre </w:t>
-            </w:r>
+              <w:t xml:space="preserve">El despliegue y la ejecución en red del proyecto </w:t>
+            </w:r>
+            <w:proofErr w:type="spellStart"/>
             <w:r>
               <w:rPr>
                 <w:rFonts w:ascii="Arial" w:hAnsi="Arial"/>
@@ -23370,7 +23949,37 @@
                 <w:iCs w:val="0"/>
                 <w:color w:val="365F91" w:themeColor="accent1" w:themeShade="BF"/>
               </w:rPr>
-              <w:t>Spring Boot</w:t>
+              <w:t>backend</w:t>
+            </w:r>
+            <w:proofErr w:type="spellEnd"/>
+            <w:r>
+              <w:rPr>
+                <w:rFonts w:ascii="Arial" w:hAnsi="Arial"/>
+                <w:i w:val="0"/>
+                <w:iCs w:val="0"/>
+                <w:color w:val="365F91" w:themeColor="accent1" w:themeShade="BF"/>
+              </w:rPr>
+              <w:t xml:space="preserve"> debe realizarse obligatoriamente sobre </w:t>
+            </w:r>
+            <w:proofErr w:type="spellStart"/>
+            <w:r>
+              <w:rPr>
+                <w:rFonts w:ascii="Arial" w:hAnsi="Arial"/>
+                <w:i w:val="0"/>
+                <w:iCs w:val="0"/>
+                <w:color w:val="365F91" w:themeColor="accent1" w:themeShade="BF"/>
+              </w:rPr>
+              <w:t>Jakarta</w:t>
+            </w:r>
+            <w:proofErr w:type="spellEnd"/>
+            <w:r>
+              <w:rPr>
+                <w:rFonts w:ascii="Arial" w:hAnsi="Arial"/>
+                <w:i w:val="0"/>
+                <w:iCs w:val="0"/>
+                <w:color w:val="365F91" w:themeColor="accent1" w:themeShade="BF"/>
+              </w:rPr>
+              <w:t xml:space="preserve"> REST (JAX-RS), </w:t>
             </w:r>
             <w:r>
               <w:rPr>
@@ -23687,28 +24296,19 @@
                 <w:iCs w:val="0"/>
                 <w:color w:val="365F91" w:themeColor="accent1" w:themeShade="BF"/>
               </w:rPr>
-              <w:t xml:space="preserve"> que incluyan un token de autenticación válido, el cual debe ser generado y proporcionado previamente por el endpoint de Login.</w:t>
-            </w:r>
-          </w:p>
-        </w:tc>
-      </w:tr>
-      <w:tr>
-        <w:tc>
-          <w:tcPr>
-            <w:cnfStyle w:val="001000000000" w:firstRow="0" w:lastRow="0" w:firstColumn="1" w:lastColumn="0" w:oddVBand="0" w:evenVBand="0" w:oddHBand="0" w:evenHBand="0" w:firstRowFirstColumn="0" w:firstRowLastColumn="0" w:lastRowFirstColumn="0" w:lastRowLastColumn="0"/>
-            <w:tcW w:w="1109" w:type="pct"/>
-          </w:tcPr>
-          <w:p>
-            <w:pPr>
-              <w:pStyle w:val="Descripcin"/>
-              <w:spacing w:before="0" w:after="0"/>
+              <w:t xml:space="preserve"> que incluyan un token de autenticación válido, el cual debe ser generado y proporcionado previamente por el </w:t>
+            </w:r>
+            <w:proofErr w:type="spellStart"/>
+            <w:r>
               <w:rPr>
                 <w:rFonts w:ascii="Arial" w:hAnsi="Arial"/>
                 <w:i w:val="0"/>
                 <w:iCs w:val="0"/>
                 <w:color w:val="365F91" w:themeColor="accent1" w:themeShade="BF"/>
               </w:rPr>
-            </w:pPr>
+              <w:t>endpoint</w:t>
+            </w:r>
+            <w:proofErr w:type="spellEnd"/>
             <w:r>
               <w:rPr>
                 <w:rFonts w:ascii="Arial" w:hAnsi="Arial"/>
@@ -23716,6 +24316,56 @@
                 <w:iCs w:val="0"/>
                 <w:color w:val="365F91" w:themeColor="accent1" w:themeShade="BF"/>
               </w:rPr>
+              <w:t xml:space="preserve"> de </w:t>
+            </w:r>
+            <w:proofErr w:type="spellStart"/>
+            <w:r>
+              <w:rPr>
+                <w:rFonts w:ascii="Arial" w:hAnsi="Arial"/>
+                <w:i w:val="0"/>
+                <w:iCs w:val="0"/>
+                <w:color w:val="365F91" w:themeColor="accent1" w:themeShade="BF"/>
+              </w:rPr>
+              <w:t>Login</w:t>
+            </w:r>
+            <w:proofErr w:type="spellEnd"/>
+            <w:r>
+              <w:rPr>
+                <w:rFonts w:ascii="Arial" w:hAnsi="Arial"/>
+                <w:i w:val="0"/>
+                <w:iCs w:val="0"/>
+                <w:color w:val="365F91" w:themeColor="accent1" w:themeShade="BF"/>
+              </w:rPr>
+              <w:t>.</w:t>
+            </w:r>
+          </w:p>
+        </w:tc>
+      </w:tr>
+      <w:tr>
+        <w:tc>
+          <w:tcPr>
+            <w:cnfStyle w:val="001000000000" w:firstRow="0" w:lastRow="0" w:firstColumn="1" w:lastColumn="0" w:oddVBand="0" w:evenVBand="0" w:oddHBand="0" w:evenHBand="0" w:firstRowFirstColumn="0" w:firstRowLastColumn="0" w:lastRowFirstColumn="0" w:lastRowLastColumn="0"/>
+            <w:tcW w:w="1109" w:type="pct"/>
+          </w:tcPr>
+          <w:p>
+            <w:pPr>
+              <w:pStyle w:val="Descripcin"/>
+              <w:spacing w:before="0" w:after="0"/>
+              <w:rPr>
+                <w:rFonts w:ascii="Arial" w:hAnsi="Arial"/>
+                <w:i w:val="0"/>
+                <w:iCs w:val="0"/>
+                <w:color w:val="365F91" w:themeColor="accent1" w:themeShade="BF"/>
+              </w:rPr>
+            </w:pPr>
+            <w:r>
+              <w:rPr>
+                <w:rFonts w:ascii="Arial" w:hAnsi="Arial"/>
+                <w:i w:val="0"/>
+                <w:iCs w:val="0"/>
+                <w:color w:val="365F91" w:themeColor="accent1" w:themeShade="BF"/>
+              </w:rPr>
+              <w:lastRenderedPageBreak/>
               <w:t>Importancia</w:t>
             </w:r>
           </w:p>
@@ -23821,7 +24471,6 @@
         <w:pStyle w:val="Descripcin"/>
       </w:pPr>
       <w:r>
-        <w:lastRenderedPageBreak/>
         <w:t xml:space="preserve">Tabla </w:t>
       </w:r>
       <w:r>
@@ -24533,7 +25182,15 @@
         <w:ind w:left="720"/>
       </w:pPr>
       <w:r>
-        <w:t>• La lógica de cálculo reside solo en el servidor; los clientes nunca la reimplementan.</w:t>
+        <w:t xml:space="preserve">• La lógica de cálculo reside solo en el servidor; los clientes nunca la </w:t>
+      </w:r>
+      <w:proofErr w:type="spellStart"/>
+      <w:r>
+        <w:t>reimplementan</w:t>
+      </w:r>
+      <w:proofErr w:type="spellEnd"/>
+      <w:r>
+        <w:t>.</w:t>
       </w:r>
     </w:p>
     <w:p>
@@ -24558,6 +25215,7 @@
     </w:p>
     <w:p>
       <w:r>
+        <w:lastRenderedPageBreak/>
         <w:t xml:space="preserve">Los equipos disponibles deben tener las siguientes características: </w:t>
       </w:r>
     </w:p>
@@ -24582,7 +25240,6 @@
         <w:ind w:left="720"/>
       </w:pPr>
       <w:r>
-        <w:lastRenderedPageBreak/>
         <w:t>• Disco de 256 GB o superior.</w:t>
       </w:r>
     </w:p>
@@ -24935,8 +25592,16 @@
         <w:rPr>
           <w:lang w:val="es-EC"/>
         </w:rPr>
-        <w:t>Menús numéricos textuales para navegar entre las opciones de login</w:t>
-      </w:r>
+        <w:t xml:space="preserve">Menús numéricos textuales para navegar entre las opciones de </w:t>
+      </w:r>
+      <w:proofErr w:type="spellStart"/>
+      <w:r>
+        <w:rPr>
+          <w:lang w:val="es-EC"/>
+        </w:rPr>
+        <w:t>login</w:t>
+      </w:r>
+      <w:proofErr w:type="spellEnd"/>
       <w:r>
         <w:rPr>
           <w:lang w:val="es-EC"/>
@@ -24989,7 +25654,23 @@
           <w:b/>
           <w:bCs/>
         </w:rPr>
-        <w:t>Periféricos de entrada (teclado, ratón y touch):</w:t>
+        <w:t xml:space="preserve">Periféricos de entrada (teclado, ratón y </w:t>
+      </w:r>
+      <w:proofErr w:type="spellStart"/>
+      <w:r>
+        <w:rPr>
+          <w:b/>
+          <w:bCs/>
+        </w:rPr>
+        <w:t>touch</w:t>
+      </w:r>
+      <w:proofErr w:type="spellEnd"/>
+      <w:r>
+        <w:rPr>
+          <w:b/>
+          <w:bCs/>
+        </w:rPr>
+        <w:t>):</w:t>
       </w:r>
       <w:r>
         <w:t xml:space="preserve"> </w:t>
@@ -25113,7 +25794,6 @@
       </w:pPr>
       <w:bookmarkStart w:id="95" w:name="_Toc58077520"/>
       <w:r>
-        <w:lastRenderedPageBreak/>
         <w:t>RECOMENDACIONES</w:t>
       </w:r>
       <w:bookmarkEnd w:id="95"/>
@@ -25145,7 +25825,15 @@
         </w:numPr>
       </w:pPr>
       <w:r>
-        <w:t xml:space="preserve">Controlar el versionamiento del archivo </w:t>
+        <w:t xml:space="preserve">Controlar el </w:t>
+      </w:r>
+      <w:proofErr w:type="spellStart"/>
+      <w:r>
+        <w:t>versionamiento</w:t>
+      </w:r>
+      <w:proofErr w:type="spellEnd"/>
+      <w:r>
+        <w:t xml:space="preserve"> del archivo </w:t>
       </w:r>
       <w:r>
         <w:t>JSON</w:t>

</xml_diff>